<commit_message>
Finishing M6 and completion of docx file.
</commit_message>
<xml_diff>
--- a/D6_PACKAGES/SAMEN/Milestone6.docx
+++ b/D6_PACKAGES/SAMEN/Milestone6.docx
@@ -6,35 +6,26 @@
       <w:pPr>
         <w:pStyle w:val="Heading1"/>
       </w:pPr>
-      <w:proofErr w:type="spellStart"/>
-      <w:r>
-        <w:t>Milestone</w:t>
-      </w:r>
-      <w:proofErr w:type="spellEnd"/>
-      <w:r>
-        <w:t xml:space="preserve"> 6 Bewijs in PDF</w:t>
-      </w:r>
-    </w:p>
-    <w:p>
-      <w:r>
-        <w:t xml:space="preserve">Romeo </w:t>
-      </w:r>
-      <w:proofErr w:type="spellStart"/>
-      <w:r>
-        <w:t>Weyns</w:t>
-      </w:r>
-      <w:proofErr w:type="spellEnd"/>
-      <w:r>
-        <w:t xml:space="preserve"> &amp; </w:t>
-      </w:r>
-      <w:r>
-        <w:t>Jonas Friedhoff - INF202</w:t>
-      </w:r>
-    </w:p>
-    <w:p/>
+      <w:r>
+        <w:t>Milestone 6 Bewijs in PDF</w:t>
+      </w:r>
+    </w:p>
+    <w:p>
+      <w:r>
+        <w:t>Romeo Weyns &amp; Jonas Friedhoff - INF202</w:t>
+      </w:r>
+    </w:p>
     <w:p>
       <w:r>
         <w:t>LET OP: gebruik de juiste naamgeving voor de functies: bewijs_milestone_6_S2</w:t>
+      </w:r>
+    </w:p>
+    <w:p>
+      <w:pPr>
+        <w:pStyle w:val="Heading1"/>
+      </w:pPr>
+      <w:r>
+        <w:t>S1 – Romeo Weyns</w:t>
       </w:r>
     </w:p>
     <w:p>
@@ -43,6 +34,1560 @@
       </w:pPr>
       <w:r>
         <w:t>Overzicht vergelijking:</w:t>
+      </w:r>
+    </w:p>
+    <w:p>
+      <w:r>
+        <w:t>bewijs_milestone_6_S1(3000, 3000, 3000, 40.000, 5, 30, ‘BOTH’)  -&gt;  minimum 49.000 rijen</w:t>
+      </w:r>
+    </w:p>
+    <w:p>
+      <w:r>
+        <w:rPr>
+          <w:noProof/>
+        </w:rPr>
+        <w:drawing>
+          <wp:inline distT="0" distB="0" distL="0" distR="0" wp14:anchorId="0118122A" wp14:editId="0090330A">
+            <wp:extent cx="4478867" cy="3181256"/>
+            <wp:effectExtent l="0" t="0" r="4445" b="0"/>
+            <wp:docPr id="220595709" name="Picture 1"/>
+            <wp:cNvGraphicFramePr>
+              <a:graphicFrameLocks xmlns:a="http://schemas.openxmlformats.org/drawingml/2006/main" noChangeAspect="1"/>
+            </wp:cNvGraphicFramePr>
+            <a:graphic xmlns:a="http://schemas.openxmlformats.org/drawingml/2006/main">
+              <a:graphicData uri="http://schemas.openxmlformats.org/drawingml/2006/picture">
+                <pic:pic xmlns:pic="http://schemas.openxmlformats.org/drawingml/2006/picture">
+                  <pic:nvPicPr>
+                    <pic:cNvPr id="220595709" name="Picture 220595709"/>
+                    <pic:cNvPicPr/>
+                  </pic:nvPicPr>
+                  <pic:blipFill>
+                    <a:blip r:embed="rId4">
+                      <a:extLst>
+                        <a:ext uri="{28A0092B-C50C-407E-A947-70E740481C1C}">
+                          <a14:useLocalDpi xmlns:a14="http://schemas.microsoft.com/office/drawing/2010/main" val="0"/>
+                        </a:ext>
+                      </a:extLst>
+                    </a:blip>
+                    <a:stretch>
+                      <a:fillRect/>
+                    </a:stretch>
+                  </pic:blipFill>
+                  <pic:spPr>
+                    <a:xfrm>
+                      <a:off x="0" y="0"/>
+                      <a:ext cx="4529933" cy="3217527"/>
+                    </a:xfrm>
+                    <a:prstGeom prst="rect">
+                      <a:avLst/>
+                    </a:prstGeom>
+                  </pic:spPr>
+                </pic:pic>
+              </a:graphicData>
+            </a:graphic>
+          </wp:inline>
+        </w:drawing>
+      </w:r>
+    </w:p>
+    <w:p>
+      <w:r>
+        <w:t>bewijs_milestone_6_S1(3000, 3000, 3000, 400.000, 5, 300, ‘BOTH’)  -&gt;  minimum 4</w:t>
+      </w:r>
+      <w:r>
+        <w:t>0</w:t>
+      </w:r>
+      <w:r>
+        <w:t>0.000 rijen</w:t>
+      </w:r>
+    </w:p>
+    <w:p>
+      <w:r>
+        <w:rPr>
+          <w:noProof/>
+        </w:rPr>
+        <w:lastRenderedPageBreak/>
+        <w:drawing>
+          <wp:inline distT="0" distB="0" distL="0" distR="0" wp14:anchorId="7B8805AB" wp14:editId="580826BF">
+            <wp:extent cx="4478655" cy="3152326"/>
+            <wp:effectExtent l="0" t="0" r="4445" b="0"/>
+            <wp:docPr id="1167339158" name="Picture 2"/>
+            <wp:cNvGraphicFramePr>
+              <a:graphicFrameLocks xmlns:a="http://schemas.openxmlformats.org/drawingml/2006/main" noChangeAspect="1"/>
+            </wp:cNvGraphicFramePr>
+            <a:graphic xmlns:a="http://schemas.openxmlformats.org/drawingml/2006/main">
+              <a:graphicData uri="http://schemas.openxmlformats.org/drawingml/2006/picture">
+                <pic:pic xmlns:pic="http://schemas.openxmlformats.org/drawingml/2006/picture">
+                  <pic:nvPicPr>
+                    <pic:cNvPr id="1167339158" name="Picture 1167339158"/>
+                    <pic:cNvPicPr/>
+                  </pic:nvPicPr>
+                  <pic:blipFill>
+                    <a:blip r:embed="rId5">
+                      <a:extLst>
+                        <a:ext uri="{28A0092B-C50C-407E-A947-70E740481C1C}">
+                          <a14:useLocalDpi xmlns:a14="http://schemas.microsoft.com/office/drawing/2010/main" val="0"/>
+                        </a:ext>
+                      </a:extLst>
+                    </a:blip>
+                    <a:stretch>
+                      <a:fillRect/>
+                    </a:stretch>
+                  </pic:blipFill>
+                  <pic:spPr>
+                    <a:xfrm>
+                      <a:off x="0" y="0"/>
+                      <a:ext cx="4541879" cy="3196827"/>
+                    </a:xfrm>
+                    <a:prstGeom prst="rect">
+                      <a:avLst/>
+                    </a:prstGeom>
+                  </pic:spPr>
+                </pic:pic>
+              </a:graphicData>
+            </a:graphic>
+          </wp:inline>
+        </w:drawing>
+      </w:r>
+    </w:p>
+    <w:p>
+      <w:pPr>
+        <w:pStyle w:val="Heading3"/>
+      </w:pPr>
+      <w:r>
+        <w:t xml:space="preserve">Resultaten </w:t>
+      </w:r>
+      <w:r>
+        <w:t xml:space="preserve">3000, 3000, 3000, 400.000, 5, 300 </w:t>
+      </w:r>
+      <w:r>
+        <w:t>(BULK vs SINGLE):</w:t>
+      </w:r>
+    </w:p>
+    <w:tbl>
+      <w:tblPr>
+        <w:tblW w:w="0" w:type="auto"/>
+        <w:tblLook w:val="04A0" w:firstRow="1" w:lastRow="0" w:firstColumn="1" w:lastColumn="0" w:noHBand="0" w:noVBand="1"/>
+      </w:tblPr>
+      <w:tblGrid>
+        <w:gridCol w:w="1708"/>
+        <w:gridCol w:w="1466"/>
+        <w:gridCol w:w="1451"/>
+        <w:gridCol w:w="1459"/>
+        <w:gridCol w:w="1466"/>
+        <w:gridCol w:w="1466"/>
+      </w:tblGrid>
+      <w:tr>
+        <w:tc>
+          <w:tcPr>
+            <w:tcW w:w="1708" w:type="dxa"/>
+            <w:tcBorders>
+              <w:top w:val="single" w:sz="4" w:space="0" w:color="auto"/>
+              <w:left w:val="single" w:sz="4" w:space="0" w:color="auto"/>
+              <w:bottom w:val="single" w:sz="4" w:space="0" w:color="auto"/>
+              <w:right w:val="single" w:sz="4" w:space="0" w:color="auto"/>
+            </w:tcBorders>
+          </w:tcPr>
+          <w:p>
+            <w:r>
+              <w:rPr>
+                <w:b/>
+              </w:rPr>
+              <w:t>Stap</w:t>
+            </w:r>
+          </w:p>
+        </w:tc>
+        <w:tc>
+          <w:tcPr>
+            <w:tcW w:w="1466" w:type="dxa"/>
+            <w:tcBorders>
+              <w:top w:val="single" w:sz="4" w:space="0" w:color="auto"/>
+              <w:left w:val="single" w:sz="4" w:space="0" w:color="auto"/>
+              <w:bottom w:val="single" w:sz="4" w:space="0" w:color="auto"/>
+              <w:right w:val="single" w:sz="4" w:space="0" w:color="auto"/>
+            </w:tcBorders>
+          </w:tcPr>
+          <w:p>
+            <w:r>
+              <w:rPr>
+                <w:b/>
+              </w:rPr>
+              <w:t>Rijen</w:t>
+            </w:r>
+          </w:p>
+        </w:tc>
+        <w:tc>
+          <w:tcPr>
+            <w:tcW w:w="1451" w:type="dxa"/>
+            <w:tcBorders>
+              <w:top w:val="single" w:sz="4" w:space="0" w:color="auto"/>
+              <w:left w:val="single" w:sz="4" w:space="0" w:color="auto"/>
+              <w:bottom w:val="single" w:sz="4" w:space="0" w:color="auto"/>
+              <w:right w:val="single" w:sz="4" w:space="0" w:color="auto"/>
+            </w:tcBorders>
+          </w:tcPr>
+          <w:p>
+            <w:r>
+              <w:rPr>
+                <w:b/>
+              </w:rPr>
+              <w:t>Gen ms BULK</w:t>
+            </w:r>
+          </w:p>
+        </w:tc>
+        <w:tc>
+          <w:tcPr>
+            <w:tcW w:w="1459" w:type="dxa"/>
+            <w:tcBorders>
+              <w:top w:val="single" w:sz="4" w:space="0" w:color="auto"/>
+              <w:left w:val="single" w:sz="4" w:space="0" w:color="auto"/>
+              <w:bottom w:val="single" w:sz="4" w:space="0" w:color="auto"/>
+              <w:right w:val="single" w:sz="4" w:space="0" w:color="auto"/>
+            </w:tcBorders>
+          </w:tcPr>
+          <w:p>
+            <w:r>
+              <w:rPr>
+                <w:b/>
+              </w:rPr>
+              <w:t>Insert ms BULK</w:t>
+            </w:r>
+          </w:p>
+        </w:tc>
+        <w:tc>
+          <w:tcPr>
+            <w:tcW w:w="1466" w:type="dxa"/>
+            <w:tcBorders>
+              <w:top w:val="single" w:sz="4" w:space="0" w:color="auto"/>
+              <w:left w:val="single" w:sz="4" w:space="0" w:color="auto"/>
+              <w:bottom w:val="single" w:sz="4" w:space="0" w:color="auto"/>
+              <w:right w:val="single" w:sz="4" w:space="0" w:color="auto"/>
+            </w:tcBorders>
+          </w:tcPr>
+          <w:p>
+            <w:r>
+              <w:rPr>
+                <w:b/>
+              </w:rPr>
+              <w:t>Gen ms SINGLE</w:t>
+            </w:r>
+          </w:p>
+        </w:tc>
+        <w:tc>
+          <w:tcPr>
+            <w:tcW w:w="1466" w:type="dxa"/>
+            <w:tcBorders>
+              <w:top w:val="single" w:sz="4" w:space="0" w:color="auto"/>
+              <w:left w:val="single" w:sz="4" w:space="0" w:color="auto"/>
+              <w:bottom w:val="single" w:sz="4" w:space="0" w:color="auto"/>
+              <w:right w:val="single" w:sz="4" w:space="0" w:color="auto"/>
+            </w:tcBorders>
+          </w:tcPr>
+          <w:p>
+            <w:r>
+              <w:rPr>
+                <w:b/>
+              </w:rPr>
+              <w:t>Insert ms SINGLE</w:t>
+            </w:r>
+          </w:p>
+        </w:tc>
+      </w:tr>
+      <w:tr>
+        <w:tc>
+          <w:tcPr>
+            <w:tcW w:w="1708" w:type="dxa"/>
+            <w:tcBorders>
+              <w:top w:val="single" w:sz="4" w:space="0" w:color="auto"/>
+              <w:left w:val="single" w:sz="4" w:space="0" w:color="auto"/>
+              <w:bottom w:val="single" w:sz="4" w:space="0" w:color="auto"/>
+              <w:right w:val="single" w:sz="4" w:space="0" w:color="auto"/>
+            </w:tcBorders>
+          </w:tcPr>
+          <w:p>
+            <w:r>
+              <w:t>Visitors</w:t>
+            </w:r>
+          </w:p>
+        </w:tc>
+        <w:tc>
+          <w:tcPr>
+            <w:tcW w:w="1466" w:type="dxa"/>
+            <w:tcBorders>
+              <w:top w:val="single" w:sz="4" w:space="0" w:color="auto"/>
+              <w:left w:val="single" w:sz="4" w:space="0" w:color="auto"/>
+              <w:bottom w:val="single" w:sz="4" w:space="0" w:color="auto"/>
+              <w:right w:val="single" w:sz="4" w:space="0" w:color="auto"/>
+            </w:tcBorders>
+          </w:tcPr>
+          <w:p>
+            <w:r>
+              <w:t>30</w:t>
+            </w:r>
+            <w:r>
+              <w:t>00</w:t>
+            </w:r>
+          </w:p>
+        </w:tc>
+        <w:tc>
+          <w:tcPr>
+            <w:tcW w:w="1451" w:type="dxa"/>
+            <w:tcBorders>
+              <w:top w:val="single" w:sz="4" w:space="0" w:color="auto"/>
+              <w:left w:val="single" w:sz="4" w:space="0" w:color="auto"/>
+              <w:bottom w:val="single" w:sz="4" w:space="0" w:color="auto"/>
+              <w:right w:val="single" w:sz="4" w:space="0" w:color="auto"/>
+            </w:tcBorders>
+          </w:tcPr>
+          <w:p>
+            <w:r>
+              <w:t>47</w:t>
+            </w:r>
+          </w:p>
+        </w:tc>
+        <w:tc>
+          <w:tcPr>
+            <w:tcW w:w="1459" w:type="dxa"/>
+            <w:tcBorders>
+              <w:top w:val="single" w:sz="4" w:space="0" w:color="auto"/>
+              <w:left w:val="single" w:sz="4" w:space="0" w:color="auto"/>
+              <w:bottom w:val="single" w:sz="4" w:space="0" w:color="auto"/>
+              <w:right w:val="single" w:sz="4" w:space="0" w:color="auto"/>
+            </w:tcBorders>
+          </w:tcPr>
+          <w:p>
+            <w:r>
+              <w:t>65</w:t>
+            </w:r>
+          </w:p>
+        </w:tc>
+        <w:tc>
+          <w:tcPr>
+            <w:tcW w:w="1466" w:type="dxa"/>
+            <w:tcBorders>
+              <w:top w:val="single" w:sz="4" w:space="0" w:color="auto"/>
+              <w:left w:val="single" w:sz="4" w:space="0" w:color="auto"/>
+              <w:bottom w:val="single" w:sz="4" w:space="0" w:color="auto"/>
+              <w:right w:val="single" w:sz="4" w:space="0" w:color="auto"/>
+            </w:tcBorders>
+          </w:tcPr>
+          <w:p>
+            <w:r>
+              <w:t>57</w:t>
+            </w:r>
+          </w:p>
+        </w:tc>
+        <w:tc>
+          <w:tcPr>
+            <w:tcW w:w="1466" w:type="dxa"/>
+            <w:tcBorders>
+              <w:top w:val="single" w:sz="4" w:space="0" w:color="auto"/>
+              <w:left w:val="single" w:sz="4" w:space="0" w:color="auto"/>
+              <w:bottom w:val="single" w:sz="4" w:space="0" w:color="auto"/>
+              <w:right w:val="single" w:sz="4" w:space="0" w:color="auto"/>
+            </w:tcBorders>
+          </w:tcPr>
+          <w:p>
+            <w:r>
+              <w:t>2</w:t>
+            </w:r>
+            <w:r>
+              <w:t>19</w:t>
+            </w:r>
+          </w:p>
+        </w:tc>
+      </w:tr>
+      <w:tr>
+        <w:tc>
+          <w:tcPr>
+            <w:tcW w:w="1708" w:type="dxa"/>
+            <w:tcBorders>
+              <w:top w:val="single" w:sz="4" w:space="0" w:color="auto"/>
+              <w:left w:val="single" w:sz="4" w:space="0" w:color="auto"/>
+              <w:bottom w:val="single" w:sz="4" w:space="0" w:color="auto"/>
+              <w:right w:val="single" w:sz="4" w:space="0" w:color="auto"/>
+            </w:tcBorders>
+          </w:tcPr>
+          <w:p>
+            <w:r>
+              <w:t>Companies</w:t>
+            </w:r>
+          </w:p>
+        </w:tc>
+        <w:tc>
+          <w:tcPr>
+            <w:tcW w:w="1466" w:type="dxa"/>
+            <w:tcBorders>
+              <w:top w:val="single" w:sz="4" w:space="0" w:color="auto"/>
+              <w:left w:val="single" w:sz="4" w:space="0" w:color="auto"/>
+              <w:bottom w:val="single" w:sz="4" w:space="0" w:color="auto"/>
+              <w:right w:val="single" w:sz="4" w:space="0" w:color="auto"/>
+            </w:tcBorders>
+          </w:tcPr>
+          <w:p>
+            <w:r>
+              <w:t>300</w:t>
+            </w:r>
+            <w:r>
+              <w:t>0</w:t>
+            </w:r>
+          </w:p>
+        </w:tc>
+        <w:tc>
+          <w:tcPr>
+            <w:tcW w:w="1451" w:type="dxa"/>
+            <w:tcBorders>
+              <w:top w:val="single" w:sz="4" w:space="0" w:color="auto"/>
+              <w:left w:val="single" w:sz="4" w:space="0" w:color="auto"/>
+              <w:bottom w:val="single" w:sz="4" w:space="0" w:color="auto"/>
+              <w:right w:val="single" w:sz="4" w:space="0" w:color="auto"/>
+            </w:tcBorders>
+          </w:tcPr>
+          <w:p>
+            <w:r>
+              <w:t>6</w:t>
+            </w:r>
+          </w:p>
+        </w:tc>
+        <w:tc>
+          <w:tcPr>
+            <w:tcW w:w="1459" w:type="dxa"/>
+            <w:tcBorders>
+              <w:top w:val="single" w:sz="4" w:space="0" w:color="auto"/>
+              <w:left w:val="single" w:sz="4" w:space="0" w:color="auto"/>
+              <w:bottom w:val="single" w:sz="4" w:space="0" w:color="auto"/>
+              <w:right w:val="single" w:sz="4" w:space="0" w:color="auto"/>
+            </w:tcBorders>
+          </w:tcPr>
+          <w:p>
+            <w:r>
+              <w:t>41</w:t>
+            </w:r>
+          </w:p>
+        </w:tc>
+        <w:tc>
+          <w:tcPr>
+            <w:tcW w:w="1466" w:type="dxa"/>
+            <w:tcBorders>
+              <w:top w:val="single" w:sz="4" w:space="0" w:color="auto"/>
+              <w:left w:val="single" w:sz="4" w:space="0" w:color="auto"/>
+              <w:bottom w:val="single" w:sz="4" w:space="0" w:color="auto"/>
+              <w:right w:val="single" w:sz="4" w:space="0" w:color="auto"/>
+            </w:tcBorders>
+          </w:tcPr>
+          <w:p>
+            <w:r>
+              <w:t>17</w:t>
+            </w:r>
+          </w:p>
+        </w:tc>
+        <w:tc>
+          <w:tcPr>
+            <w:tcW w:w="1466" w:type="dxa"/>
+            <w:tcBorders>
+              <w:top w:val="single" w:sz="4" w:space="0" w:color="auto"/>
+              <w:left w:val="single" w:sz="4" w:space="0" w:color="auto"/>
+              <w:bottom w:val="single" w:sz="4" w:space="0" w:color="auto"/>
+              <w:right w:val="single" w:sz="4" w:space="0" w:color="auto"/>
+            </w:tcBorders>
+          </w:tcPr>
+          <w:p>
+            <w:r>
+              <w:t>211</w:t>
+            </w:r>
+          </w:p>
+        </w:tc>
+      </w:tr>
+      <w:tr>
+        <w:tc>
+          <w:tcPr>
+            <w:tcW w:w="1708" w:type="dxa"/>
+            <w:tcBorders>
+              <w:top w:val="single" w:sz="4" w:space="0" w:color="auto"/>
+              <w:left w:val="single" w:sz="4" w:space="0" w:color="auto"/>
+              <w:bottom w:val="single" w:sz="4" w:space="0" w:color="auto"/>
+              <w:right w:val="single" w:sz="4" w:space="0" w:color="auto"/>
+            </w:tcBorders>
+          </w:tcPr>
+          <w:p>
+            <w:r>
+              <w:t>Ticketplatforms</w:t>
+            </w:r>
+          </w:p>
+        </w:tc>
+        <w:tc>
+          <w:tcPr>
+            <w:tcW w:w="1466" w:type="dxa"/>
+            <w:tcBorders>
+              <w:top w:val="single" w:sz="4" w:space="0" w:color="auto"/>
+              <w:left w:val="single" w:sz="4" w:space="0" w:color="auto"/>
+              <w:bottom w:val="single" w:sz="4" w:space="0" w:color="auto"/>
+              <w:right w:val="single" w:sz="4" w:space="0" w:color="auto"/>
+            </w:tcBorders>
+          </w:tcPr>
+          <w:p>
+            <w:r>
+              <w:t>30</w:t>
+            </w:r>
+            <w:r>
+              <w:t>00</w:t>
+            </w:r>
+          </w:p>
+        </w:tc>
+        <w:tc>
+          <w:tcPr>
+            <w:tcW w:w="1451" w:type="dxa"/>
+            <w:tcBorders>
+              <w:top w:val="single" w:sz="4" w:space="0" w:color="auto"/>
+              <w:left w:val="single" w:sz="4" w:space="0" w:color="auto"/>
+              <w:bottom w:val="single" w:sz="4" w:space="0" w:color="auto"/>
+              <w:right w:val="single" w:sz="4" w:space="0" w:color="auto"/>
+            </w:tcBorders>
+          </w:tcPr>
+          <w:p>
+            <w:r>
+              <w:t>8</w:t>
+            </w:r>
+          </w:p>
+        </w:tc>
+        <w:tc>
+          <w:tcPr>
+            <w:tcW w:w="1459" w:type="dxa"/>
+            <w:tcBorders>
+              <w:top w:val="single" w:sz="4" w:space="0" w:color="auto"/>
+              <w:left w:val="single" w:sz="4" w:space="0" w:color="auto"/>
+              <w:bottom w:val="single" w:sz="4" w:space="0" w:color="auto"/>
+              <w:right w:val="single" w:sz="4" w:space="0" w:color="auto"/>
+            </w:tcBorders>
+          </w:tcPr>
+          <w:p>
+            <w:r>
+              <w:t>105</w:t>
+            </w:r>
+          </w:p>
+        </w:tc>
+        <w:tc>
+          <w:tcPr>
+            <w:tcW w:w="1466" w:type="dxa"/>
+            <w:tcBorders>
+              <w:top w:val="single" w:sz="4" w:space="0" w:color="auto"/>
+              <w:left w:val="single" w:sz="4" w:space="0" w:color="auto"/>
+              <w:bottom w:val="single" w:sz="4" w:space="0" w:color="auto"/>
+              <w:right w:val="single" w:sz="4" w:space="0" w:color="auto"/>
+            </w:tcBorders>
+          </w:tcPr>
+          <w:p>
+            <w:r>
+              <w:t>21</w:t>
+            </w:r>
+          </w:p>
+        </w:tc>
+        <w:tc>
+          <w:tcPr>
+            <w:tcW w:w="1466" w:type="dxa"/>
+            <w:tcBorders>
+              <w:top w:val="single" w:sz="4" w:space="0" w:color="auto"/>
+              <w:left w:val="single" w:sz="4" w:space="0" w:color="auto"/>
+              <w:bottom w:val="single" w:sz="4" w:space="0" w:color="auto"/>
+              <w:right w:val="single" w:sz="4" w:space="0" w:color="auto"/>
+            </w:tcBorders>
+          </w:tcPr>
+          <w:p>
+            <w:r>
+              <w:t>273</w:t>
+            </w:r>
+          </w:p>
+        </w:tc>
+      </w:tr>
+      <w:tr>
+        <w:tc>
+          <w:tcPr>
+            <w:tcW w:w="1708" w:type="dxa"/>
+            <w:tcBorders>
+              <w:top w:val="single" w:sz="4" w:space="0" w:color="auto"/>
+              <w:left w:val="single" w:sz="4" w:space="0" w:color="auto"/>
+              <w:bottom w:val="single" w:sz="4" w:space="0" w:color="auto"/>
+              <w:right w:val="single" w:sz="4" w:space="0" w:color="auto"/>
+            </w:tcBorders>
+          </w:tcPr>
+          <w:p>
+            <w:r>
+              <w:t>Tickets</w:t>
+            </w:r>
+          </w:p>
+        </w:tc>
+        <w:tc>
+          <w:tcPr>
+            <w:tcW w:w="1466" w:type="dxa"/>
+            <w:tcBorders>
+              <w:top w:val="single" w:sz="4" w:space="0" w:color="auto"/>
+              <w:left w:val="single" w:sz="4" w:space="0" w:color="auto"/>
+              <w:bottom w:val="single" w:sz="4" w:space="0" w:color="auto"/>
+              <w:right w:val="single" w:sz="4" w:space="0" w:color="auto"/>
+            </w:tcBorders>
+          </w:tcPr>
+          <w:p>
+            <w:r>
+              <w:t>400.000</w:t>
+            </w:r>
+          </w:p>
+        </w:tc>
+        <w:tc>
+          <w:tcPr>
+            <w:tcW w:w="1451" w:type="dxa"/>
+            <w:tcBorders>
+              <w:top w:val="single" w:sz="4" w:space="0" w:color="auto"/>
+              <w:left w:val="single" w:sz="4" w:space="0" w:color="auto"/>
+              <w:bottom w:val="single" w:sz="4" w:space="0" w:color="auto"/>
+              <w:right w:val="single" w:sz="4" w:space="0" w:color="auto"/>
+            </w:tcBorders>
+          </w:tcPr>
+          <w:p>
+            <w:r>
+              <w:t>6752</w:t>
+            </w:r>
+          </w:p>
+        </w:tc>
+        <w:tc>
+          <w:tcPr>
+            <w:tcW w:w="1459" w:type="dxa"/>
+            <w:tcBorders>
+              <w:top w:val="single" w:sz="4" w:space="0" w:color="auto"/>
+              <w:left w:val="single" w:sz="4" w:space="0" w:color="auto"/>
+              <w:bottom w:val="single" w:sz="4" w:space="0" w:color="auto"/>
+              <w:right w:val="single" w:sz="4" w:space="0" w:color="auto"/>
+            </w:tcBorders>
+          </w:tcPr>
+          <w:p>
+            <w:r>
+              <w:t>10.636</w:t>
+            </w:r>
+          </w:p>
+        </w:tc>
+        <w:tc>
+          <w:tcPr>
+            <w:tcW w:w="1466" w:type="dxa"/>
+            <w:tcBorders>
+              <w:top w:val="single" w:sz="4" w:space="0" w:color="auto"/>
+              <w:left w:val="single" w:sz="4" w:space="0" w:color="auto"/>
+              <w:bottom w:val="single" w:sz="4" w:space="0" w:color="auto"/>
+              <w:right w:val="single" w:sz="4" w:space="0" w:color="auto"/>
+            </w:tcBorders>
+          </w:tcPr>
+          <w:p>
+            <w:r>
+              <w:t>8017</w:t>
+            </w:r>
+          </w:p>
+        </w:tc>
+        <w:tc>
+          <w:tcPr>
+            <w:tcW w:w="1466" w:type="dxa"/>
+            <w:tcBorders>
+              <w:top w:val="single" w:sz="4" w:space="0" w:color="auto"/>
+              <w:left w:val="single" w:sz="4" w:space="0" w:color="auto"/>
+              <w:bottom w:val="single" w:sz="4" w:space="0" w:color="auto"/>
+              <w:right w:val="single" w:sz="4" w:space="0" w:color="auto"/>
+            </w:tcBorders>
+          </w:tcPr>
+          <w:p>
+            <w:r>
+              <w:t>37.737</w:t>
+            </w:r>
+          </w:p>
+        </w:tc>
+      </w:tr>
+      <w:tr>
+        <w:tc>
+          <w:tcPr>
+            <w:tcW w:w="1708" w:type="dxa"/>
+            <w:tcBorders>
+              <w:top w:val="single" w:sz="4" w:space="0" w:color="auto"/>
+              <w:left w:val="single" w:sz="4" w:space="0" w:color="auto"/>
+              <w:bottom w:val="single" w:sz="4" w:space="0" w:color="auto"/>
+              <w:right w:val="single" w:sz="4" w:space="0" w:color="auto"/>
+            </w:tcBorders>
+          </w:tcPr>
+          <w:p>
+            <w:r>
+              <w:t>Festivals</w:t>
+            </w:r>
+          </w:p>
+        </w:tc>
+        <w:tc>
+          <w:tcPr>
+            <w:tcW w:w="1466" w:type="dxa"/>
+            <w:tcBorders>
+              <w:top w:val="single" w:sz="4" w:space="0" w:color="auto"/>
+              <w:left w:val="single" w:sz="4" w:space="0" w:color="auto"/>
+              <w:bottom w:val="single" w:sz="4" w:space="0" w:color="auto"/>
+              <w:right w:val="single" w:sz="4" w:space="0" w:color="auto"/>
+            </w:tcBorders>
+          </w:tcPr>
+          <w:p>
+            <w:r>
+              <w:t>300</w:t>
+            </w:r>
+          </w:p>
+        </w:tc>
+        <w:tc>
+          <w:tcPr>
+            <w:tcW w:w="1451" w:type="dxa"/>
+            <w:tcBorders>
+              <w:top w:val="single" w:sz="4" w:space="0" w:color="auto"/>
+              <w:left w:val="single" w:sz="4" w:space="0" w:color="auto"/>
+              <w:bottom w:val="single" w:sz="4" w:space="0" w:color="auto"/>
+              <w:right w:val="single" w:sz="4" w:space="0" w:color="auto"/>
+            </w:tcBorders>
+          </w:tcPr>
+          <w:p>
+            <w:r>
+              <w:t>20</w:t>
+            </w:r>
+          </w:p>
+        </w:tc>
+        <w:tc>
+          <w:tcPr>
+            <w:tcW w:w="1459" w:type="dxa"/>
+            <w:tcBorders>
+              <w:top w:val="single" w:sz="4" w:space="0" w:color="auto"/>
+              <w:left w:val="single" w:sz="4" w:space="0" w:color="auto"/>
+              <w:bottom w:val="single" w:sz="4" w:space="0" w:color="auto"/>
+              <w:right w:val="single" w:sz="4" w:space="0" w:color="auto"/>
+            </w:tcBorders>
+          </w:tcPr>
+          <w:p>
+            <w:r>
+              <w:t>9</w:t>
+            </w:r>
+          </w:p>
+        </w:tc>
+        <w:tc>
+          <w:tcPr>
+            <w:tcW w:w="1466" w:type="dxa"/>
+            <w:tcBorders>
+              <w:top w:val="single" w:sz="4" w:space="0" w:color="auto"/>
+              <w:left w:val="single" w:sz="4" w:space="0" w:color="auto"/>
+              <w:bottom w:val="single" w:sz="4" w:space="0" w:color="auto"/>
+              <w:right w:val="single" w:sz="4" w:space="0" w:color="auto"/>
+            </w:tcBorders>
+          </w:tcPr>
+          <w:p>
+            <w:r>
+              <w:t>20</w:t>
+            </w:r>
+          </w:p>
+        </w:tc>
+        <w:tc>
+          <w:tcPr>
+            <w:tcW w:w="1466" w:type="dxa"/>
+            <w:tcBorders>
+              <w:top w:val="single" w:sz="4" w:space="0" w:color="auto"/>
+              <w:left w:val="single" w:sz="4" w:space="0" w:color="auto"/>
+              <w:bottom w:val="single" w:sz="4" w:space="0" w:color="auto"/>
+              <w:right w:val="single" w:sz="4" w:space="0" w:color="auto"/>
+            </w:tcBorders>
+          </w:tcPr>
+          <w:p>
+            <w:r>
+              <w:t>7</w:t>
+            </w:r>
+          </w:p>
+        </w:tc>
+      </w:tr>
+      <w:tr>
+        <w:tc>
+          <w:tcPr>
+            <w:tcW w:w="1708" w:type="dxa"/>
+            <w:tcBorders>
+              <w:top w:val="single" w:sz="4" w:space="0" w:color="auto"/>
+              <w:left w:val="single" w:sz="4" w:space="0" w:color="auto"/>
+              <w:bottom w:val="single" w:sz="4" w:space="0" w:color="auto"/>
+              <w:right w:val="single" w:sz="4" w:space="0" w:color="auto"/>
+            </w:tcBorders>
+          </w:tcPr>
+          <w:p>
+            <w:r>
+              <w:t>Permits</w:t>
+            </w:r>
+          </w:p>
+        </w:tc>
+        <w:tc>
+          <w:tcPr>
+            <w:tcW w:w="1466" w:type="dxa"/>
+            <w:tcBorders>
+              <w:top w:val="single" w:sz="4" w:space="0" w:color="auto"/>
+              <w:left w:val="single" w:sz="4" w:space="0" w:color="auto"/>
+              <w:bottom w:val="single" w:sz="4" w:space="0" w:color="auto"/>
+              <w:right w:val="single" w:sz="4" w:space="0" w:color="auto"/>
+            </w:tcBorders>
+          </w:tcPr>
+          <w:p>
+            <w:r>
+              <w:t>1500</w:t>
+            </w:r>
+          </w:p>
+        </w:tc>
+        <w:tc>
+          <w:tcPr>
+            <w:tcW w:w="1451" w:type="dxa"/>
+            <w:tcBorders>
+              <w:top w:val="single" w:sz="4" w:space="0" w:color="auto"/>
+              <w:left w:val="single" w:sz="4" w:space="0" w:color="auto"/>
+              <w:bottom w:val="single" w:sz="4" w:space="0" w:color="auto"/>
+              <w:right w:val="single" w:sz="4" w:space="0" w:color="auto"/>
+            </w:tcBorders>
+          </w:tcPr>
+          <w:p>
+            <w:r>
+              <w:t>12</w:t>
+            </w:r>
+          </w:p>
+        </w:tc>
+        <w:tc>
+          <w:tcPr>
+            <w:tcW w:w="1459" w:type="dxa"/>
+            <w:tcBorders>
+              <w:top w:val="single" w:sz="4" w:space="0" w:color="auto"/>
+              <w:left w:val="single" w:sz="4" w:space="0" w:color="auto"/>
+              <w:bottom w:val="single" w:sz="4" w:space="0" w:color="auto"/>
+              <w:right w:val="single" w:sz="4" w:space="0" w:color="auto"/>
+            </w:tcBorders>
+          </w:tcPr>
+          <w:p>
+            <w:r>
+              <w:t>23</w:t>
+            </w:r>
+          </w:p>
+        </w:tc>
+        <w:tc>
+          <w:tcPr>
+            <w:tcW w:w="1466" w:type="dxa"/>
+            <w:tcBorders>
+              <w:top w:val="single" w:sz="4" w:space="0" w:color="auto"/>
+              <w:left w:val="single" w:sz="4" w:space="0" w:color="auto"/>
+              <w:bottom w:val="single" w:sz="4" w:space="0" w:color="auto"/>
+              <w:right w:val="single" w:sz="4" w:space="0" w:color="auto"/>
+            </w:tcBorders>
+          </w:tcPr>
+          <w:p>
+            <w:r>
+              <w:t>23</w:t>
+            </w:r>
+          </w:p>
+        </w:tc>
+        <w:tc>
+          <w:tcPr>
+            <w:tcW w:w="1466" w:type="dxa"/>
+            <w:tcBorders>
+              <w:top w:val="single" w:sz="4" w:space="0" w:color="auto"/>
+              <w:left w:val="single" w:sz="4" w:space="0" w:color="auto"/>
+              <w:bottom w:val="single" w:sz="4" w:space="0" w:color="auto"/>
+              <w:right w:val="single" w:sz="4" w:space="0" w:color="auto"/>
+            </w:tcBorders>
+          </w:tcPr>
+          <w:p>
+            <w:r>
+              <w:t>92</w:t>
+            </w:r>
+          </w:p>
+        </w:tc>
+      </w:tr>
+      <w:tr>
+        <w:tc>
+          <w:tcPr>
+            <w:tcW w:w="1708" w:type="dxa"/>
+            <w:tcBorders>
+              <w:top w:val="single" w:sz="4" w:space="0" w:color="auto"/>
+              <w:left w:val="single" w:sz="4" w:space="0" w:color="auto"/>
+              <w:bottom w:val="single" w:sz="4" w:space="0" w:color="auto"/>
+              <w:right w:val="single" w:sz="4" w:space="0" w:color="auto"/>
+            </w:tcBorders>
+          </w:tcPr>
+          <w:p>
+            <w:r>
+              <w:t>Totaal</w:t>
+            </w:r>
+          </w:p>
+        </w:tc>
+        <w:tc>
+          <w:tcPr>
+            <w:tcW w:w="1466" w:type="dxa"/>
+            <w:tcBorders>
+              <w:top w:val="single" w:sz="4" w:space="0" w:color="auto"/>
+              <w:left w:val="single" w:sz="4" w:space="0" w:color="auto"/>
+              <w:bottom w:val="single" w:sz="4" w:space="0" w:color="auto"/>
+              <w:right w:val="single" w:sz="4" w:space="0" w:color="auto"/>
+            </w:tcBorders>
+          </w:tcPr>
+          <w:p>
+            <w:r>
+              <w:t>410.800</w:t>
+            </w:r>
+          </w:p>
+        </w:tc>
+        <w:tc>
+          <w:tcPr>
+            <w:tcW w:w="1451" w:type="dxa"/>
+            <w:tcBorders>
+              <w:top w:val="single" w:sz="4" w:space="0" w:color="auto"/>
+              <w:left w:val="single" w:sz="4" w:space="0" w:color="auto"/>
+              <w:bottom w:val="single" w:sz="4" w:space="0" w:color="auto"/>
+              <w:right w:val="single" w:sz="4" w:space="0" w:color="auto"/>
+            </w:tcBorders>
+          </w:tcPr>
+          <w:p>
+            <w:r>
+              <w:t>-</w:t>
+            </w:r>
+          </w:p>
+        </w:tc>
+        <w:tc>
+          <w:tcPr>
+            <w:tcW w:w="1459" w:type="dxa"/>
+            <w:tcBorders>
+              <w:top w:val="single" w:sz="4" w:space="0" w:color="auto"/>
+              <w:left w:val="single" w:sz="4" w:space="0" w:color="auto"/>
+              <w:bottom w:val="single" w:sz="4" w:space="0" w:color="auto"/>
+              <w:right w:val="single" w:sz="4" w:space="0" w:color="auto"/>
+            </w:tcBorders>
+          </w:tcPr>
+          <w:p>
+            <w:r>
+              <w:t>17</w:t>
+            </w:r>
+            <w:r>
+              <w:t>.</w:t>
+            </w:r>
+            <w:r>
+              <w:t>951</w:t>
+            </w:r>
+          </w:p>
+        </w:tc>
+        <w:tc>
+          <w:tcPr>
+            <w:tcW w:w="1466" w:type="dxa"/>
+            <w:tcBorders>
+              <w:top w:val="single" w:sz="4" w:space="0" w:color="auto"/>
+              <w:left w:val="single" w:sz="4" w:space="0" w:color="auto"/>
+              <w:bottom w:val="single" w:sz="4" w:space="0" w:color="auto"/>
+              <w:right w:val="single" w:sz="4" w:space="0" w:color="auto"/>
+            </w:tcBorders>
+          </w:tcPr>
+          <w:p>
+            <w:r>
+              <w:t>-</w:t>
+            </w:r>
+          </w:p>
+        </w:tc>
+        <w:tc>
+          <w:tcPr>
+            <w:tcW w:w="1466" w:type="dxa"/>
+            <w:tcBorders>
+              <w:top w:val="single" w:sz="4" w:space="0" w:color="auto"/>
+              <w:left w:val="single" w:sz="4" w:space="0" w:color="auto"/>
+              <w:bottom w:val="single" w:sz="4" w:space="0" w:color="auto"/>
+              <w:right w:val="single" w:sz="4" w:space="0" w:color="auto"/>
+            </w:tcBorders>
+          </w:tcPr>
+          <w:p>
+            <w:r>
+              <w:t>46</w:t>
+            </w:r>
+            <w:r>
+              <w:t>.</w:t>
+            </w:r>
+            <w:r>
+              <w:t>858</w:t>
+            </w:r>
+          </w:p>
+        </w:tc>
+      </w:tr>
+    </w:tbl>
+    <w:p/>
+    <w:p>
+      <w:r>
+        <w:t xml:space="preserve">Verhouding SINGLE / BULK op deze run: </w:t>
+      </w:r>
+      <w:r>
+        <w:t>2.61</w:t>
+      </w:r>
+      <w:r>
+        <w:t>x.</w:t>
+      </w:r>
+    </w:p>
+    <w:p>
+      <w:pPr>
+        <w:pStyle w:val="Heading3"/>
+      </w:pPr>
+      <w:r>
+        <w:t>Segmentgrootte van de TICKET tabel na de 400.000-run:</w:t>
+      </w:r>
+    </w:p>
+    <w:p>
+      <w:r>
+        <w:rPr>
+          <w:noProof/>
+        </w:rPr>
+        <w:drawing>
+          <wp:inline distT="0" distB="0" distL="0" distR="0" wp14:anchorId="5CB622A8" wp14:editId="3C4804D5">
+            <wp:extent cx="5041900" cy="342900"/>
+            <wp:effectExtent l="0" t="0" r="0" b="0"/>
+            <wp:docPr id="1352624964" name="Picture 3"/>
+            <wp:cNvGraphicFramePr>
+              <a:graphicFrameLocks xmlns:a="http://schemas.openxmlformats.org/drawingml/2006/main" noChangeAspect="1"/>
+            </wp:cNvGraphicFramePr>
+            <a:graphic xmlns:a="http://schemas.openxmlformats.org/drawingml/2006/main">
+              <a:graphicData uri="http://schemas.openxmlformats.org/drawingml/2006/picture">
+                <pic:pic xmlns:pic="http://schemas.openxmlformats.org/drawingml/2006/picture">
+                  <pic:nvPicPr>
+                    <pic:cNvPr id="1352624964" name="Picture 1352624964"/>
+                    <pic:cNvPicPr/>
+                  </pic:nvPicPr>
+                  <pic:blipFill>
+                    <a:blip r:embed="rId6">
+                      <a:extLst>
+                        <a:ext uri="{28A0092B-C50C-407E-A947-70E740481C1C}">
+                          <a14:useLocalDpi xmlns:a14="http://schemas.microsoft.com/office/drawing/2010/main" val="0"/>
+                        </a:ext>
+                      </a:extLst>
+                    </a:blip>
+                    <a:stretch>
+                      <a:fillRect/>
+                    </a:stretch>
+                  </pic:blipFill>
+                  <pic:spPr>
+                    <a:xfrm>
+                      <a:off x="0" y="0"/>
+                      <a:ext cx="5041900" cy="342900"/>
+                    </a:xfrm>
+                    <a:prstGeom prst="rect">
+                      <a:avLst/>
+                    </a:prstGeom>
+                  </pic:spPr>
+                </pic:pic>
+              </a:graphicData>
+            </a:graphic>
+          </wp:inline>
+        </w:drawing>
+      </w:r>
+    </w:p>
+    <w:p>
+      <w:pPr>
+        <w:pStyle w:val="Heading3"/>
+      </w:pPr>
+      <w:r>
+        <w:t>Conclusie:</w:t>
+      </w:r>
+    </w:p>
+    <w:p>
+      <w:r>
+        <w:t xml:space="preserve">Bij kleine en middelgrote tabellen (Festivals met 300 rijen, Permits met 1 500 rijen) is het verschil tussen BULK en SINGLE inserts beperkt maar al zichtbaar: Permits zijn 4x trager bij SINGLE (92 ms vs 23 ms insert). Bij de basisgegevens (Companies, TicketPlatforms, Visitors — elk 3 000 rijen) is de insert-fase bij SINGLE al 3 tot 5 keer trager dan bij BULK, terwijl de generatie-fase grotendeels vergelijkbaar is. </w:t>
+      </w:r>
+    </w:p>
+    <w:p>
+      <w:r>
+        <w:lastRenderedPageBreak/>
+        <w:t xml:space="preserve">Het fundamentele verschil verschijnt bij de 400 000 Tickets: BULK voert die inserts uit in ±10,6 seconden, SINGLE heeft er ±37,7 seconden voor nodig, 3,5x trager voor exact dezelfde data. </w:t>
+      </w:r>
+    </w:p>
+    <w:p>
+      <w:r>
+        <w:t>De generatie-fase is voor Tickets ietwat trager bij SINGLE (8 017 ms vs 6 752 ms) door het herhaaldelijk ophogen van de in-memory comboteller bij botsingen; de rest van de tijdverschillen is puur insert-overhead. Conclusie: FORALL loont meetbaar vanaf een paar duizend rijen; de meerwinst is het grootst bij de N-N-junctietabel Ticket, waar ook de generatielogica zelf aan complexiteit wint.</w:t>
+      </w:r>
+    </w:p>
+    <w:p>
+      <w:pPr>
+        <w:pStyle w:val="Heading3"/>
+      </w:pPr>
+      <w:r>
+        <w:t>Moeilijkheid:</w:t>
+      </w:r>
+    </w:p>
+    <w:p>
+      <w:r>
+        <w:t xml:space="preserve"> De grootste uitdaging voor S1 was de compound-uniqueness constraint op de Ticket-tabel: dezelfde combinatie van VISITOR_ID, FESTIVAL_ID en TICKET_DATE mag slechts één keer voorkomen. Bij een N-N-junction met 400 000 rijen, 3 000 bezoekers en 300 festivals zijn botsingen realistisch en mag het generatiealgoritme geen enkele dubbele combinatie naar de database sturen. </w:t>
+      </w:r>
+    </w:p>
+    <w:p>
+      <w:r>
+        <w:t>Een tweede moeilijkheid was de verdeling van tickets over festivals: puur willekeurige toewijzing zou systematisch de eerste festivals in de tabel bevoordelen en een onrealistisch gelijke spreiding geven. Daarbovenop bestond het probleem dat bij SINGLE-row inserts de generatie-tijd en insert-tijd van nature door elkaar lopen in dezelfde loop, waardoor ze afzonderlijk niet meetbaar zijn, het probleem dat ook S2 tegenkwam.</w:t>
+      </w:r>
+    </w:p>
+    <w:p>
+      <w:pPr>
+        <w:pStyle w:val="Heading3"/>
+      </w:pPr>
+      <w:r>
+        <w:t>Hoe opgelost:</w:t>
+      </w:r>
+    </w:p>
+    <w:p>
+      <w:r>
+        <w:t>Voor de BULK-generator worden twee opeenvolgende algoritmen gecombineerd. Eerst wordt de festivalvolgorde met een volledige Fisher-Yates shuffle in PL/SQL gerandomiseerd, zodat de verdeling niet systematisch de eerst geladen festivals bevoordeelt. Daarna wordt via stick-breaking het totale ticketbudget verdeeld: elk festival claimt een willekeurig deel van het resterende budget, wat een realistische ongelijke spreidin geeft (van 0 tot maximaal het aantal bezoekers per festival). Per festival wordt vervolgens een sparse partiële Fisher-Yates uitgevoerd over de bezoekerspool om exact het gevraagde aantal unieke bezoekers te selecteren, zonder enige retry en met wiskundige garantie op uniciteit. Omdat de arrays bij 400 000+ rijen te groot worden voor het PGA, worden ze opgeknipt in chunks van C_BULK_CHUNK rijen; elke chunk wordt via FORALL … SAVE EXCEPTIONS naar de database gestuurd en daarna vrijgegeven.</w:t>
+      </w:r>
+    </w:p>
+    <w:p>
+      <w:r>
+        <w:t>Voor de SINGLE-generator is uniciteit anders opgelost: een in-memory associatieve array (t_combo_set, geïndexeerd op de samengestelde sleutel visitor_id || '_' || festival_id || '_' || datum) houdt bij welke combinaties al gegenereerd zijn. Bij een botsing slaat de WHILE-loop die iteratie over en probeert een nieuwe combinatie, tot het gevraagde aantal unieke tickets bereikt is. Dit legt de uniciteitscontrole volledig in PL/SQL en vermijdt round-trips naar de database.</w:t>
+      </w:r>
+    </w:p>
+    <w:p>
+      <w:r>
+        <w:t>Voor het opsplitten van generatie- en insert-tijd is dezelfde aanpak als S2 toegepast: elke single-insert procedure werd herschreven in twee opeenvolgende lussen. Loop 1 vult alle PL/SQL-collecties met gegenereerde waarden en neemt tijdstempel v_gen_done; loop 2 itereert daarna over diezelfde collecties en doet één INSERT per rij, gevolgd door tijdstempel v_end. Zo zijn de gen- en insert-fasen voor SINGLE en BULK op exacte dezelfde manier gemeten en is de vergelijking eerlijk.</w:t>
+      </w:r>
+    </w:p>
+    <w:p>
+      <w:pPr>
+        <w:pStyle w:val="Heading2"/>
+      </w:pPr>
+      <w:r>
+        <w:lastRenderedPageBreak/>
+        <w:t>Overzicht functies:</w:t>
+      </w:r>
+    </w:p>
+    <w:p>
+      <w:r>
+        <w:rPr>
+          <w:noProof/>
+        </w:rPr>
+        <w:drawing>
+          <wp:inline distT="0" distB="0" distL="0" distR="0" wp14:anchorId="4450A172" wp14:editId="7731A3AD">
+            <wp:extent cx="3251200" cy="3953598"/>
+            <wp:effectExtent l="0" t="0" r="0" b="0"/>
+            <wp:docPr id="382438466" name="Picture 4"/>
+            <wp:cNvGraphicFramePr>
+              <a:graphicFrameLocks xmlns:a="http://schemas.openxmlformats.org/drawingml/2006/main" noChangeAspect="1"/>
+            </wp:cNvGraphicFramePr>
+            <a:graphic xmlns:a="http://schemas.openxmlformats.org/drawingml/2006/main">
+              <a:graphicData uri="http://schemas.openxmlformats.org/drawingml/2006/picture">
+                <pic:pic xmlns:pic="http://schemas.openxmlformats.org/drawingml/2006/picture">
+                  <pic:nvPicPr>
+                    <pic:cNvPr id="382438466" name="Picture 382438466"/>
+                    <pic:cNvPicPr/>
+                  </pic:nvPicPr>
+                  <pic:blipFill>
+                    <a:blip r:embed="rId7" cstate="print">
+                      <a:extLst>
+                        <a:ext uri="{28A0092B-C50C-407E-A947-70E740481C1C}">
+                          <a14:useLocalDpi xmlns:a14="http://schemas.microsoft.com/office/drawing/2010/main" val="0"/>
+                        </a:ext>
+                      </a:extLst>
+                    </a:blip>
+                    <a:stretch>
+                      <a:fillRect/>
+                    </a:stretch>
+                  </pic:blipFill>
+                  <pic:spPr>
+                    <a:xfrm>
+                      <a:off x="0" y="0"/>
+                      <a:ext cx="3283130" cy="3992426"/>
+                    </a:xfrm>
+                    <a:prstGeom prst="rect">
+                      <a:avLst/>
+                    </a:prstGeom>
+                  </pic:spPr>
+                </pic:pic>
+              </a:graphicData>
+            </a:graphic>
+          </wp:inline>
+        </w:drawing>
+      </w:r>
+    </w:p>
+    <w:p>
+      <w:r>
+        <w:rPr>
+          <w:noProof/>
+        </w:rPr>
+        <w:drawing>
+          <wp:inline distT="0" distB="0" distL="0" distR="0" wp14:anchorId="5B8870C2" wp14:editId="048180AA">
+            <wp:extent cx="3243391" cy="3775211"/>
+            <wp:effectExtent l="0" t="0" r="0" b="0"/>
+            <wp:docPr id="1715835190" name="Picture 5"/>
+            <wp:cNvGraphicFramePr>
+              <a:graphicFrameLocks xmlns:a="http://schemas.openxmlformats.org/drawingml/2006/main" noChangeAspect="1"/>
+            </wp:cNvGraphicFramePr>
+            <a:graphic xmlns:a="http://schemas.openxmlformats.org/drawingml/2006/main">
+              <a:graphicData uri="http://schemas.openxmlformats.org/drawingml/2006/picture">
+                <pic:pic xmlns:pic="http://schemas.openxmlformats.org/drawingml/2006/picture">
+                  <pic:nvPicPr>
+                    <pic:cNvPr id="1715835190" name="Picture 1715835190"/>
+                    <pic:cNvPicPr/>
+                  </pic:nvPicPr>
+                  <pic:blipFill>
+                    <a:blip r:embed="rId8" cstate="print">
+                      <a:extLst>
+                        <a:ext uri="{28A0092B-C50C-407E-A947-70E740481C1C}">
+                          <a14:useLocalDpi xmlns:a14="http://schemas.microsoft.com/office/drawing/2010/main" val="0"/>
+                        </a:ext>
+                      </a:extLst>
+                    </a:blip>
+                    <a:stretch>
+                      <a:fillRect/>
+                    </a:stretch>
+                  </pic:blipFill>
+                  <pic:spPr>
+                    <a:xfrm>
+                      <a:off x="0" y="0"/>
+                      <a:ext cx="3291201" cy="3830860"/>
+                    </a:xfrm>
+                    <a:prstGeom prst="rect">
+                      <a:avLst/>
+                    </a:prstGeom>
+                  </pic:spPr>
+                </pic:pic>
+              </a:graphicData>
+            </a:graphic>
+          </wp:inline>
+        </w:drawing>
+      </w:r>
+    </w:p>
+    <w:p>
+      <w:r>
+        <w:rPr>
+          <w:noProof/>
+        </w:rPr>
+        <w:lastRenderedPageBreak/>
+        <w:drawing>
+          <wp:inline distT="0" distB="0" distL="0" distR="0" wp14:anchorId="4086967B" wp14:editId="350B106A">
+            <wp:extent cx="3242733" cy="3162976"/>
+            <wp:effectExtent l="0" t="0" r="0" b="0"/>
+            <wp:docPr id="1837789132" name="Picture 7"/>
+            <wp:cNvGraphicFramePr>
+              <a:graphicFrameLocks xmlns:a="http://schemas.openxmlformats.org/drawingml/2006/main" noChangeAspect="1"/>
+            </wp:cNvGraphicFramePr>
+            <a:graphic xmlns:a="http://schemas.openxmlformats.org/drawingml/2006/main">
+              <a:graphicData uri="http://schemas.openxmlformats.org/drawingml/2006/picture">
+                <pic:pic xmlns:pic="http://schemas.openxmlformats.org/drawingml/2006/picture">
+                  <pic:nvPicPr>
+                    <pic:cNvPr id="1837789132" name="Picture 1837789132"/>
+                    <pic:cNvPicPr/>
+                  </pic:nvPicPr>
+                  <pic:blipFill>
+                    <a:blip r:embed="rId9" cstate="print">
+                      <a:extLst>
+                        <a:ext uri="{28A0092B-C50C-407E-A947-70E740481C1C}">
+                          <a14:useLocalDpi xmlns:a14="http://schemas.microsoft.com/office/drawing/2010/main" val="0"/>
+                        </a:ext>
+                      </a:extLst>
+                    </a:blip>
+                    <a:stretch>
+                      <a:fillRect/>
+                    </a:stretch>
+                  </pic:blipFill>
+                  <pic:spPr>
+                    <a:xfrm>
+                      <a:off x="0" y="0"/>
+                      <a:ext cx="3276313" cy="3195730"/>
+                    </a:xfrm>
+                    <a:prstGeom prst="rect">
+                      <a:avLst/>
+                    </a:prstGeom>
+                  </pic:spPr>
+                </pic:pic>
+              </a:graphicData>
+            </a:graphic>
+          </wp:inline>
+        </w:drawing>
+      </w:r>
+    </w:p>
+    <w:p>
+      <w:r>
+        <w:rPr>
+          <w:noProof/>
+        </w:rPr>
+        <w:drawing>
+          <wp:inline distT="0" distB="0" distL="0" distR="0" wp14:anchorId="6C758EB8" wp14:editId="00E6E5D0">
+            <wp:extent cx="3242310" cy="4353015"/>
+            <wp:effectExtent l="0" t="0" r="0" b="3175"/>
+            <wp:docPr id="753608201" name="Picture 8"/>
+            <wp:cNvGraphicFramePr>
+              <a:graphicFrameLocks xmlns:a="http://schemas.openxmlformats.org/drawingml/2006/main" noChangeAspect="1"/>
+            </wp:cNvGraphicFramePr>
+            <a:graphic xmlns:a="http://schemas.openxmlformats.org/drawingml/2006/main">
+              <a:graphicData uri="http://schemas.openxmlformats.org/drawingml/2006/picture">
+                <pic:pic xmlns:pic="http://schemas.openxmlformats.org/drawingml/2006/picture">
+                  <pic:nvPicPr>
+                    <pic:cNvPr id="753608201" name="Picture 753608201"/>
+                    <pic:cNvPicPr/>
+                  </pic:nvPicPr>
+                  <pic:blipFill>
+                    <a:blip r:embed="rId10" cstate="print">
+                      <a:extLst>
+                        <a:ext uri="{28A0092B-C50C-407E-A947-70E740481C1C}">
+                          <a14:useLocalDpi xmlns:a14="http://schemas.microsoft.com/office/drawing/2010/main" val="0"/>
+                        </a:ext>
+                      </a:extLst>
+                    </a:blip>
+                    <a:stretch>
+                      <a:fillRect/>
+                    </a:stretch>
+                  </pic:blipFill>
+                  <pic:spPr>
+                    <a:xfrm>
+                      <a:off x="0" y="0"/>
+                      <a:ext cx="3277070" cy="4399683"/>
+                    </a:xfrm>
+                    <a:prstGeom prst="rect">
+                      <a:avLst/>
+                    </a:prstGeom>
+                  </pic:spPr>
+                </pic:pic>
+              </a:graphicData>
+            </a:graphic>
+          </wp:inline>
+        </w:drawing>
+      </w:r>
+    </w:p>
+    <w:p>
+      <w:r>
+        <w:rPr>
+          <w:noProof/>
+        </w:rPr>
+        <w:lastRenderedPageBreak/>
+        <w:drawing>
+          <wp:inline distT="0" distB="0" distL="0" distR="0" wp14:anchorId="53D50DD8" wp14:editId="4BA7D6C3">
+            <wp:extent cx="3242733" cy="2977595"/>
+            <wp:effectExtent l="0" t="0" r="0" b="0"/>
+            <wp:docPr id="1305659303" name="Picture 9"/>
+            <wp:cNvGraphicFramePr>
+              <a:graphicFrameLocks xmlns:a="http://schemas.openxmlformats.org/drawingml/2006/main" noChangeAspect="1"/>
+            </wp:cNvGraphicFramePr>
+            <a:graphic xmlns:a="http://schemas.openxmlformats.org/drawingml/2006/main">
+              <a:graphicData uri="http://schemas.openxmlformats.org/drawingml/2006/picture">
+                <pic:pic xmlns:pic="http://schemas.openxmlformats.org/drawingml/2006/picture">
+                  <pic:nvPicPr>
+                    <pic:cNvPr id="1305659303" name="Picture 1305659303"/>
+                    <pic:cNvPicPr/>
+                  </pic:nvPicPr>
+                  <pic:blipFill>
+                    <a:blip r:embed="rId11" cstate="print">
+                      <a:extLst>
+                        <a:ext uri="{28A0092B-C50C-407E-A947-70E740481C1C}">
+                          <a14:useLocalDpi xmlns:a14="http://schemas.microsoft.com/office/drawing/2010/main" val="0"/>
+                        </a:ext>
+                      </a:extLst>
+                    </a:blip>
+                    <a:stretch>
+                      <a:fillRect/>
+                    </a:stretch>
+                  </pic:blipFill>
+                  <pic:spPr>
+                    <a:xfrm>
+                      <a:off x="0" y="0"/>
+                      <a:ext cx="3292609" cy="3023392"/>
+                    </a:xfrm>
+                    <a:prstGeom prst="rect">
+                      <a:avLst/>
+                    </a:prstGeom>
+                  </pic:spPr>
+                </pic:pic>
+              </a:graphicData>
+            </a:graphic>
+          </wp:inline>
+        </w:drawing>
+      </w:r>
+    </w:p>
+    <w:p>
+      <w:r>
+        <w:rPr>
+          <w:noProof/>
+        </w:rPr>
+        <w:drawing>
+          <wp:inline distT="0" distB="0" distL="0" distR="0" wp14:anchorId="17EBB587" wp14:editId="5526C6DC">
+            <wp:extent cx="3242310" cy="4249200"/>
+            <wp:effectExtent l="0" t="0" r="0" b="5715"/>
+            <wp:docPr id="1540955892" name="Picture 10"/>
+            <wp:cNvGraphicFramePr>
+              <a:graphicFrameLocks xmlns:a="http://schemas.openxmlformats.org/drawingml/2006/main" noChangeAspect="1"/>
+            </wp:cNvGraphicFramePr>
+            <a:graphic xmlns:a="http://schemas.openxmlformats.org/drawingml/2006/main">
+              <a:graphicData uri="http://schemas.openxmlformats.org/drawingml/2006/picture">
+                <pic:pic xmlns:pic="http://schemas.openxmlformats.org/drawingml/2006/picture">
+                  <pic:nvPicPr>
+                    <pic:cNvPr id="1540955892" name="Picture 1540955892"/>
+                    <pic:cNvPicPr/>
+                  </pic:nvPicPr>
+                  <pic:blipFill>
+                    <a:blip r:embed="rId12" cstate="print">
+                      <a:extLst>
+                        <a:ext uri="{28A0092B-C50C-407E-A947-70E740481C1C}">
+                          <a14:useLocalDpi xmlns:a14="http://schemas.microsoft.com/office/drawing/2010/main" val="0"/>
+                        </a:ext>
+                      </a:extLst>
+                    </a:blip>
+                    <a:stretch>
+                      <a:fillRect/>
+                    </a:stretch>
+                  </pic:blipFill>
+                  <pic:spPr>
+                    <a:xfrm>
+                      <a:off x="0" y="0"/>
+                      <a:ext cx="3279773" cy="4298297"/>
+                    </a:xfrm>
+                    <a:prstGeom prst="rect">
+                      <a:avLst/>
+                    </a:prstGeom>
+                  </pic:spPr>
+                </pic:pic>
+              </a:graphicData>
+            </a:graphic>
+          </wp:inline>
+        </w:drawing>
+      </w:r>
+    </w:p>
+    <w:p>
+      <w:r>
+        <w:rPr>
+          <w:noProof/>
+        </w:rPr>
+        <w:lastRenderedPageBreak/>
+        <w:drawing>
+          <wp:inline distT="0" distB="0" distL="0" distR="0" wp14:anchorId="5F76C67D" wp14:editId="2D33981E">
+            <wp:extent cx="3242733" cy="4523516"/>
+            <wp:effectExtent l="0" t="0" r="0" b="0"/>
+            <wp:docPr id="1439926324" name="Picture 11"/>
+            <wp:cNvGraphicFramePr>
+              <a:graphicFrameLocks xmlns:a="http://schemas.openxmlformats.org/drawingml/2006/main" noChangeAspect="1"/>
+            </wp:cNvGraphicFramePr>
+            <a:graphic xmlns:a="http://schemas.openxmlformats.org/drawingml/2006/main">
+              <a:graphicData uri="http://schemas.openxmlformats.org/drawingml/2006/picture">
+                <pic:pic xmlns:pic="http://schemas.openxmlformats.org/drawingml/2006/picture">
+                  <pic:nvPicPr>
+                    <pic:cNvPr id="1439926324" name="Picture 1439926324"/>
+                    <pic:cNvPicPr/>
+                  </pic:nvPicPr>
+                  <pic:blipFill>
+                    <a:blip r:embed="rId13" cstate="print">
+                      <a:extLst>
+                        <a:ext uri="{28A0092B-C50C-407E-A947-70E740481C1C}">
+                          <a14:useLocalDpi xmlns:a14="http://schemas.microsoft.com/office/drawing/2010/main" val="0"/>
+                        </a:ext>
+                      </a:extLst>
+                    </a:blip>
+                    <a:stretch>
+                      <a:fillRect/>
+                    </a:stretch>
+                  </pic:blipFill>
+                  <pic:spPr>
+                    <a:xfrm>
+                      <a:off x="0" y="0"/>
+                      <a:ext cx="3277185" cy="4571576"/>
+                    </a:xfrm>
+                    <a:prstGeom prst="rect">
+                      <a:avLst/>
+                    </a:prstGeom>
+                  </pic:spPr>
+                </pic:pic>
+              </a:graphicData>
+            </a:graphic>
+          </wp:inline>
+        </w:drawing>
+      </w:r>
+    </w:p>
+    <w:p>
+      <w:r>
+        <w:rPr>
+          <w:noProof/>
+        </w:rPr>
+        <w:lastRenderedPageBreak/>
+        <w:drawing>
+          <wp:inline distT="0" distB="0" distL="0" distR="0" wp14:anchorId="138FB630" wp14:editId="4693037D">
+            <wp:extent cx="3242733" cy="4275622"/>
+            <wp:effectExtent l="0" t="0" r="0" b="4445"/>
+            <wp:docPr id="226607981" name="Picture 12"/>
+            <wp:cNvGraphicFramePr>
+              <a:graphicFrameLocks xmlns:a="http://schemas.openxmlformats.org/drawingml/2006/main" noChangeAspect="1"/>
+            </wp:cNvGraphicFramePr>
+            <a:graphic xmlns:a="http://schemas.openxmlformats.org/drawingml/2006/main">
+              <a:graphicData uri="http://schemas.openxmlformats.org/drawingml/2006/picture">
+                <pic:pic xmlns:pic="http://schemas.openxmlformats.org/drawingml/2006/picture">
+                  <pic:nvPicPr>
+                    <pic:cNvPr id="226607981" name="Picture 226607981"/>
+                    <pic:cNvPicPr/>
+                  </pic:nvPicPr>
+                  <pic:blipFill>
+                    <a:blip r:embed="rId14" cstate="print">
+                      <a:extLst>
+                        <a:ext uri="{28A0092B-C50C-407E-A947-70E740481C1C}">
+                          <a14:useLocalDpi xmlns:a14="http://schemas.microsoft.com/office/drawing/2010/main" val="0"/>
+                        </a:ext>
+                      </a:extLst>
+                    </a:blip>
+                    <a:stretch>
+                      <a:fillRect/>
+                    </a:stretch>
+                  </pic:blipFill>
+                  <pic:spPr>
+                    <a:xfrm>
+                      <a:off x="0" y="0"/>
+                      <a:ext cx="3324033" cy="4382817"/>
+                    </a:xfrm>
+                    <a:prstGeom prst="rect">
+                      <a:avLst/>
+                    </a:prstGeom>
+                  </pic:spPr>
+                </pic:pic>
+              </a:graphicData>
+            </a:graphic>
+          </wp:inline>
+        </w:drawing>
+      </w:r>
+    </w:p>
+    <w:p>
+      <w:r>
+        <w:rPr>
+          <w:noProof/>
+        </w:rPr>
+        <w:drawing>
+          <wp:inline distT="0" distB="0" distL="0" distR="0" wp14:anchorId="696558A4" wp14:editId="4FA6A19E">
+            <wp:extent cx="3242310" cy="1205179"/>
+            <wp:effectExtent l="0" t="0" r="0" b="1905"/>
+            <wp:docPr id="2117266589" name="Picture 13"/>
+            <wp:cNvGraphicFramePr>
+              <a:graphicFrameLocks xmlns:a="http://schemas.openxmlformats.org/drawingml/2006/main" noChangeAspect="1"/>
+            </wp:cNvGraphicFramePr>
+            <a:graphic xmlns:a="http://schemas.openxmlformats.org/drawingml/2006/main">
+              <a:graphicData uri="http://schemas.openxmlformats.org/drawingml/2006/picture">
+                <pic:pic xmlns:pic="http://schemas.openxmlformats.org/drawingml/2006/picture">
+                  <pic:nvPicPr>
+                    <pic:cNvPr id="2117266589" name="Picture 2117266589"/>
+                    <pic:cNvPicPr/>
+                  </pic:nvPicPr>
+                  <pic:blipFill>
+                    <a:blip r:embed="rId15" cstate="print">
+                      <a:extLst>
+                        <a:ext uri="{28A0092B-C50C-407E-A947-70E740481C1C}">
+                          <a14:useLocalDpi xmlns:a14="http://schemas.microsoft.com/office/drawing/2010/main" val="0"/>
+                        </a:ext>
+                      </a:extLst>
+                    </a:blip>
+                    <a:stretch>
+                      <a:fillRect/>
+                    </a:stretch>
+                  </pic:blipFill>
+                  <pic:spPr>
+                    <a:xfrm>
+                      <a:off x="0" y="0"/>
+                      <a:ext cx="3335889" cy="1239963"/>
+                    </a:xfrm>
+                    <a:prstGeom prst="rect">
+                      <a:avLst/>
+                    </a:prstGeom>
+                  </pic:spPr>
+                </pic:pic>
+              </a:graphicData>
+            </a:graphic>
+          </wp:inline>
+        </w:drawing>
+      </w:r>
+    </w:p>
+    <w:p/>
+    <w:p>
+      <w:pPr>
+        <w:pStyle w:val="Heading1"/>
+      </w:pPr>
+      <w:r>
+        <w:t>S2 – Jonas Friedhoff</w:t>
       </w:r>
     </w:p>
     <w:p>
@@ -74,7 +1619,7 @@
                     <pic:cNvPicPr/>
                   </pic:nvPicPr>
                   <pic:blipFill>
-                    <a:blip r:embed="rId4"/>
+                    <a:blip r:embed="rId16"/>
                     <a:stretch>
                       <a:fillRect/>
                     </a:stretch>
@@ -97,6 +1642,7 @@
     </w:p>
     <w:p>
       <w:r>
+        <w:lastRenderedPageBreak/>
         <w:t>bewijs_milestone_6_S2(30, 30, 30, 600, 'BOTH')  -&gt;  minimum 540.000 rijen</w:t>
       </w:r>
     </w:p>
@@ -124,7 +1670,7 @@
                     <pic:cNvPicPr/>
                   </pic:nvPicPr>
                   <pic:blipFill>
-                    <a:blip r:embed="rId5"/>
+                    <a:blip r:embed="rId17"/>
                     <a:stretch>
                       <a:fillRect/>
                     </a:stretch>
@@ -150,15 +1696,7 @@
         <w:pStyle w:val="Heading3"/>
       </w:pPr>
       <w:r>
-        <w:t xml:space="preserve">Resultaten 30, 30, 30, 600 (BULK </w:t>
-      </w:r>
-      <w:proofErr w:type="spellStart"/>
-      <w:r>
-        <w:t>vs</w:t>
-      </w:r>
-      <w:proofErr w:type="spellEnd"/>
-      <w:r>
-        <w:t xml:space="preserve"> SINGLE):</w:t>
+        <w:t>Resultaten 30, 30, 30, 600 (BULK vs SINGLE):</w:t>
       </w:r>
     </w:p>
     <w:tbl>
@@ -243,19 +1781,11 @@
             </w:tcBorders>
           </w:tcPr>
           <w:p>
-            <w:proofErr w:type="spellStart"/>
             <w:r>
               <w:rPr>
                 <w:b/>
               </w:rPr>
-              <w:t>Insert</w:t>
-            </w:r>
-            <w:proofErr w:type="spellEnd"/>
-            <w:r>
-              <w:rPr>
-                <w:b/>
-              </w:rPr>
-              <w:t xml:space="preserve"> ms BULK</w:t>
+              <w:t>Insert ms BULK</w:t>
             </w:r>
           </w:p>
         </w:tc>
@@ -289,19 +1819,11 @@
             </w:tcBorders>
           </w:tcPr>
           <w:p>
-            <w:proofErr w:type="spellStart"/>
             <w:r>
               <w:rPr>
                 <w:b/>
               </w:rPr>
-              <w:t>Insert</w:t>
-            </w:r>
-            <w:proofErr w:type="spellEnd"/>
-            <w:r>
-              <w:rPr>
-                <w:b/>
-              </w:rPr>
-              <w:t xml:space="preserve"> ms SINGLE</w:t>
+              <w:t>Insert ms SINGLE</w:t>
             </w:r>
           </w:p>
         </w:tc>
@@ -416,11 +1938,9 @@
             </w:tcBorders>
           </w:tcPr>
           <w:p>
-            <w:proofErr w:type="spellStart"/>
             <w:r>
               <w:t>Artists</w:t>
             </w:r>
-            <w:proofErr w:type="spellEnd"/>
           </w:p>
         </w:tc>
         <w:tc>
@@ -669,10 +2189,7 @@
           </w:tcPr>
           <w:p>
             <w:r>
-              <w:t>6</w:t>
-            </w:r>
-            <w:r>
-              <w:t>1</w:t>
+              <w:t>61</w:t>
             </w:r>
           </w:p>
         </w:tc>
@@ -829,7 +2346,6 @@
           </w:tcPr>
           <w:p>
             <w:r>
-              <w:lastRenderedPageBreak/>
               <w:t>Totaal</w:t>
             </w:r>
           </w:p>
@@ -954,7 +2470,7 @@
                     <pic:cNvPicPr/>
                   </pic:nvPicPr>
                   <pic:blipFill>
-                    <a:blip r:embed="rId6"/>
+                    <a:blip r:embed="rId18"/>
                     <a:stretch>
                       <a:fillRect/>
                     </a:stretch>
@@ -985,39 +2501,7 @@
     </w:p>
     <w:p>
       <w:r>
-        <w:t xml:space="preserve">Bij kleine tabellen (Genres, </w:t>
-      </w:r>
-      <w:proofErr w:type="spellStart"/>
-      <w:r>
-        <w:t>Artists</w:t>
-      </w:r>
-      <w:proofErr w:type="spellEnd"/>
-      <w:r>
-        <w:t xml:space="preserve">, Festivals - telkens onder de 300 rijen) is het verschil tussen BULK en SINGLE </w:t>
-      </w:r>
-      <w:proofErr w:type="spellStart"/>
-      <w:r>
-        <w:t>inserts</w:t>
-      </w:r>
-      <w:proofErr w:type="spellEnd"/>
-      <w:r>
-        <w:t xml:space="preserve"> verwaarloosbaar: beide methodes blijven onder de 20 milliseconden. Vanaf 1 200 Stages wordt SINGLE al merkbaar trager dan BULK op de </w:t>
-      </w:r>
-      <w:proofErr w:type="spellStart"/>
-      <w:r>
-        <w:t>insert</w:t>
-      </w:r>
-      <w:proofErr w:type="spellEnd"/>
-      <w:r>
-        <w:t xml:space="preserve">-fase (65 ms versus 51 ms). Het echte verschil verschijnt pas bij de 732 000 Performances: BULK doet die </w:t>
-      </w:r>
-      <w:proofErr w:type="spellStart"/>
-      <w:r>
-        <w:t>inserts</w:t>
-      </w:r>
-      <w:proofErr w:type="spellEnd"/>
-      <w:r>
-        <w:t xml:space="preserve"> in ongeveer 9,5 seconden, SINGLE heeft er ongeveer </w:t>
+        <w:t xml:space="preserve">Bij kleine tabellen (Genres, Artists, Festivals - telkens onder de 300 rijen) is het verschil tussen BULK en SINGLE inserts verwaarloosbaar: beide methodes blijven onder de 20 milliseconden. Vanaf 1 200 Stages wordt SINGLE al merkbaar trager dan BULK op de insert-fase (65 ms versus 51 ms). Het echte verschil verschijnt pas bij de 732 000 Performances: BULK doet die inserts in ongeveer 9,5 seconden, SINGLE heeft er ongeveer </w:t>
       </w:r>
       <w:r>
         <w:t>46,6</w:t>
@@ -1046,15 +2530,7 @@
         <w:t>7</w:t>
       </w:r>
       <w:r>
-        <w:t xml:space="preserve"> s), wat ook logisch is: enkel de manier waarop de data naar de databank geschreven wordt verschilt. Conclusie: BULK loont pas vanaf duizenden rijen per </w:t>
-      </w:r>
-      <w:proofErr w:type="spellStart"/>
-      <w:r>
-        <w:t>insert</w:t>
-      </w:r>
-      <w:proofErr w:type="spellEnd"/>
-      <w:r>
-        <w:t>; voor kleinere tabellen weegt de extra complexiteit niet op tegen de winst.</w:t>
+        <w:t xml:space="preserve"> s), wat ook logisch is: enkel de manier waarop de data naar de databank geschreven wordt verschilt. Conclusie: BULK loont pas vanaf duizenden rijen per insert; voor kleinere tabellen weegt de extra complexiteit niet op tegen de winst.</w:t>
       </w:r>
     </w:p>
     <w:p>
@@ -1062,89 +2538,18 @@
         <w:pStyle w:val="Heading3"/>
       </w:pPr>
       <w:r>
+        <w:lastRenderedPageBreak/>
         <w:t>Moeilijkheid:</w:t>
       </w:r>
     </w:p>
     <w:p>
       <w:r>
-        <w:t xml:space="preserve">Omdat ik in </w:t>
-      </w:r>
-      <w:proofErr w:type="spellStart"/>
-      <w:r>
-        <w:t>Milestone</w:t>
-      </w:r>
-      <w:proofErr w:type="spellEnd"/>
-      <w:r>
-        <w:t xml:space="preserve"> 5 al BULK (FORALL) had gebruikt, moest ik voor </w:t>
-      </w:r>
-      <w:proofErr w:type="spellStart"/>
-      <w:r>
-        <w:t>Milestone</w:t>
-      </w:r>
-      <w:proofErr w:type="spellEnd"/>
-      <w:r>
-        <w:t xml:space="preserve"> 6 het omgekeerde maken: single-</w:t>
-      </w:r>
-      <w:proofErr w:type="spellStart"/>
-      <w:r>
-        <w:t>row</w:t>
-      </w:r>
-      <w:proofErr w:type="spellEnd"/>
-      <w:r>
-        <w:t xml:space="preserve"> </w:t>
-      </w:r>
-      <w:proofErr w:type="spellStart"/>
-      <w:r>
-        <w:t>insert</w:t>
-      </w:r>
-      <w:proofErr w:type="spellEnd"/>
-      <w:r>
-        <w:t xml:space="preserve"> versies om te kunnen vergelijken. De grootste uitdaging was de </w:t>
-      </w:r>
-      <w:proofErr w:type="spellStart"/>
-      <w:r>
-        <w:t>generatie-tijd</w:t>
-      </w:r>
-      <w:proofErr w:type="spellEnd"/>
-      <w:r>
-        <w:t xml:space="preserve"> en </w:t>
-      </w:r>
-      <w:proofErr w:type="spellStart"/>
-      <w:r>
-        <w:t>insert</w:t>
-      </w:r>
-      <w:proofErr w:type="spellEnd"/>
-      <w:r>
-        <w:t xml:space="preserve">-tijd afzonderlijk meten voor die single-versies. Bij de BULK-versie is dat eenvoudig - het FORALL-statement vormt een natuurlijke grens tussen 'data in arrays opbouwen' en 'data wegschrijven'. Bij </w:t>
-      </w:r>
-      <w:proofErr w:type="spellStart"/>
-      <w:r>
-        <w:t>row-by-row</w:t>
-      </w:r>
-      <w:proofErr w:type="spellEnd"/>
-      <w:r>
-        <w:t xml:space="preserve"> </w:t>
-      </w:r>
-      <w:proofErr w:type="spellStart"/>
-      <w:r>
-        <w:t>inserts</w:t>
-      </w:r>
-      <w:proofErr w:type="spellEnd"/>
-      <w:r>
-        <w:t xml:space="preserve"> staan die twee stappen normaal door elkaar in dezelfde loop, waardoor je hun aandeel niet meer apart kan meten.</w:t>
-      </w:r>
-    </w:p>
-    <w:p>
-      <w:r>
-        <w:t xml:space="preserve">Een tweede probleem was dat de APPEND_VALUES hint die ik wilde gebruiken om BULK nog sneller te maken, op Oracle </w:t>
-      </w:r>
-      <w:proofErr w:type="spellStart"/>
-      <w:r>
-        <w:t>Autonomous</w:t>
-      </w:r>
-      <w:proofErr w:type="spellEnd"/>
-      <w:r>
-        <w:t xml:space="preserve"> Database niet compatibel is met FORALL ... </w:t>
+        <w:t>Omdat ik in Milestone 5 al BULK (FORALL) had gebruikt, moest ik voor Milestone 6 het omgekeerde maken: single-row insert versies om te kunnen vergelijken. De grootste uitdaging was de generatie-tijd en insert-tijd afzonderlijk meten voor die single-versies. Bij de BULK-versie is dat eenvoudig - het FORALL-statement vormt een natuurlijke grens tussen 'data in arrays opbouwen' en 'data wegschrijven'. Bij row-by-row inserts staan die twee stappen normaal door elkaar in dezelfde loop, waardoor je hun aandeel niet meer apart kan meten.</w:t>
+      </w:r>
+    </w:p>
+    <w:p>
+      <w:r>
+        <w:t xml:space="preserve">Een tweede probleem was dat de APPEND_VALUES hint die ik wilde gebruiken om BULK nog sneller te maken, op Oracle Autonomous Database niet compatibel is met FORALL ... </w:t>
       </w:r>
       <w:r>
         <w:rPr>
@@ -1153,15 +2558,7 @@
         <w:t xml:space="preserve">SAVE EXCEPTIONS (ORA-38910 'BATCH ERROR mode is not supported for this operation'). </w:t>
       </w:r>
       <w:r>
-        <w:t xml:space="preserve">Die </w:t>
-      </w:r>
-      <w:proofErr w:type="spellStart"/>
-      <w:r>
-        <w:t>exception</w:t>
-      </w:r>
-      <w:proofErr w:type="spellEnd"/>
-      <w:r>
-        <w:t>-afhandeling wou ik wel behouden voor robuustheid.</w:t>
+        <w:t>Die exception-afhandeling wou ik wel behouden voor robuustheid.</w:t>
       </w:r>
     </w:p>
     <w:p>
@@ -1174,84 +2571,12 @@
     </w:p>
     <w:p>
       <w:r>
-        <w:t>Voor de timing splitste ik elke single-</w:t>
-      </w:r>
-      <w:proofErr w:type="spellStart"/>
-      <w:r>
-        <w:t>insert</w:t>
-      </w:r>
-      <w:proofErr w:type="spellEnd"/>
-      <w:r>
-        <w:t xml:space="preserve"> procedure in twee opeenvolgende loops: loop 1 vult de PL/SQL-collecties met random data en stopt zodra alle rijen klaar zijn (tijdstempel </w:t>
-      </w:r>
-      <w:proofErr w:type="spellStart"/>
-      <w:r>
-        <w:t>v_gen_done</w:t>
-      </w:r>
-      <w:proofErr w:type="spellEnd"/>
-      <w:r>
-        <w:t xml:space="preserve">); loop 2 itereert daarna over diezelfde collecties en doet een INSERT per rij (tijdstempel </w:t>
-      </w:r>
-      <w:proofErr w:type="spellStart"/>
-      <w:r>
-        <w:t>v_end</w:t>
-      </w:r>
-      <w:proofErr w:type="spellEnd"/>
-      <w:r>
-        <w:t xml:space="preserve">). Zo komen de gen- en </w:t>
-      </w:r>
-      <w:proofErr w:type="spellStart"/>
-      <w:r>
-        <w:t>insert</w:t>
-      </w:r>
-      <w:proofErr w:type="spellEnd"/>
-      <w:r>
-        <w:t>-fasen exact overeen met de BULK-versie en is de vergelijking eerlijk.</w:t>
-      </w:r>
-    </w:p>
-    <w:p>
-      <w:r>
-        <w:t xml:space="preserve">Voor de APPEND_VALUES kwestie heb ik de hint weggehaald en in plaats daarvan op andere optimalisaties ingezet die wel naast SAVE EXCEPTIONS werken: DBMS_RANDOM.VALUE </w:t>
-      </w:r>
-      <w:proofErr w:type="spellStart"/>
-      <w:r>
-        <w:t>inline</w:t>
-      </w:r>
-      <w:proofErr w:type="spellEnd"/>
-      <w:r>
-        <w:t xml:space="preserve"> gebruiken in de hot loop (in plaats van via de helper-functies in PKG_SAMEN te gaan), per-stage constanten buiten de </w:t>
-      </w:r>
-      <w:proofErr w:type="spellStart"/>
-      <w:r>
-        <w:t>inner</w:t>
-      </w:r>
-      <w:proofErr w:type="spellEnd"/>
-      <w:r>
-        <w:t xml:space="preserve"> loop hijsen, SYS_GUID() vervangen door een </w:t>
-      </w:r>
-      <w:proofErr w:type="spellStart"/>
-      <w:r>
-        <w:t>session-scoped</w:t>
-      </w:r>
-      <w:proofErr w:type="spellEnd"/>
-      <w:r>
-        <w:t xml:space="preserve"> </w:t>
-      </w:r>
-      <w:proofErr w:type="spellStart"/>
-      <w:r>
-        <w:t>g_seq</w:t>
-      </w:r>
-      <w:proofErr w:type="spellEnd"/>
-      <w:r>
-        <w:t xml:space="preserve"> PLS_INTEGER counter in </w:t>
-      </w:r>
-      <w:proofErr w:type="spellStart"/>
-      <w:r>
-        <w:t>give_unique_combo</w:t>
-      </w:r>
-      <w:proofErr w:type="spellEnd"/>
-      <w:r>
-        <w:t>, en TRUNCATE TABLE gebruiken in plaats van DELETE FROM voor de reset_to_M4 tussen de BULK- en SINGLE-runs.</w:t>
+        <w:t>Voor de timing splitste ik elke single-insert procedure in twee opeenvolgende loops: loop 1 vult de PL/SQL-collecties met random data en stopt zodra alle rijen klaar zijn (tijdstempel v_gen_done); loop 2 itereert daarna over diezelfde collecties en doet een INSERT per rij (tijdstempel v_end). Zo komen de gen- en insert-fasen exact overeen met de BULK-versie en is de vergelijking eerlijk.</w:t>
+      </w:r>
+    </w:p>
+    <w:p>
+      <w:r>
+        <w:t>Voor de APPEND_VALUES kwestie heb ik de hint weggehaald en in plaats daarvan op andere optimalisaties ingezet die wel naast SAVE EXCEPTIONS werken: DBMS_RANDOM.VALUE inline gebruiken in de hot loop (in plaats van via de helper-functies in PKG_SAMEN te gaan), per-stage constanten buiten de inner loop hijsen, SYS_GUID() vervangen door een session-scoped g_seq PLS_INTEGER counter in give_unique_combo, en TRUNCATE TABLE gebruiken in plaats van DELETE FROM voor de reset_to_M4 tussen de BULK- en SINGLE-runs.</w:t>
       </w:r>
     </w:p>
     <w:p>
@@ -1266,7 +2591,6 @@
         <w:rPr>
           <w:lang w:val="en-US"/>
         </w:rPr>
-        <w:lastRenderedPageBreak/>
         <w:t>Overzicht</w:t>
       </w:r>
       <w:proofErr w:type="spellEnd"/>
@@ -1312,6 +2636,7 @@
         <w:rPr>
           <w:noProof/>
         </w:rPr>
+        <w:lastRenderedPageBreak/>
         <w:drawing>
           <wp:inline distT="0" distB="0" distL="0" distR="0" wp14:anchorId="1763AA94" wp14:editId="3E190AE2">
             <wp:extent cx="4705350" cy="4961534"/>
@@ -1328,7 +2653,7 @@
                     <pic:cNvPicPr/>
                   </pic:nvPicPr>
                   <pic:blipFill>
-                    <a:blip r:embed="rId7"/>
+                    <a:blip r:embed="rId19"/>
                     <a:stretch>
                       <a:fillRect/>
                     </a:stretch>
@@ -1378,7 +2703,7 @@
                     <pic:cNvPicPr/>
                   </pic:nvPicPr>
                   <pic:blipFill>
-                    <a:blip r:embed="rId8"/>
+                    <a:blip r:embed="rId20"/>
                     <a:stretch>
                       <a:fillRect/>
                     </a:stretch>
@@ -1836,7 +3161,6 @@
     <w:next w:val="Normal"/>
     <w:link w:val="Heading2Char"/>
     <w:uiPriority w:val="9"/>
-    <w:semiHidden/>
     <w:unhideWhenUsed/>
     <w:qFormat/>
     <w:rsid w:val="007F62CB"/>
@@ -1859,7 +3183,6 @@
     <w:next w:val="Normal"/>
     <w:link w:val="Heading3Char"/>
     <w:uiPriority w:val="9"/>
-    <w:semiHidden/>
     <w:unhideWhenUsed/>
     <w:qFormat/>
     <w:rsid w:val="007F62CB"/>
@@ -2053,7 +3376,6 @@
     <w:basedOn w:val="DefaultParagraphFont"/>
     <w:link w:val="Heading2"/>
     <w:uiPriority w:val="9"/>
-    <w:semiHidden/>
     <w:rsid w:val="007F62CB"/>
     <w:rPr>
       <w:rFonts w:asciiTheme="majorHAnsi" w:eastAsiaTheme="majorEastAsia" w:hAnsiTheme="majorHAnsi" w:cstheme="majorBidi"/>
@@ -2067,7 +3389,6 @@
     <w:basedOn w:val="DefaultParagraphFont"/>
     <w:link w:val="Heading3"/>
     <w:uiPriority w:val="9"/>
-    <w:semiHidden/>
     <w:rsid w:val="007F62CB"/>
     <w:rPr>
       <w:rFonts w:eastAsiaTheme="majorEastAsia" w:cstheme="majorBidi"/>

</xml_diff>